<commit_message>
feat: add trial enrollment functionality, enhancing user experience by allowing trial periods for courses, and update related models, services, and routes for comprehensive support
</commit_message>
<xml_diff>
--- a/frontend/public/course-certificates/Certificates/Airkrit India Course Certificate - AI-01171 - Template.docx
+++ b/frontend/public/course-certificates/Certificates/Airkrit India Course Certificate - AI-01171 - Template.docx
@@ -1,6 +1,6 @@
 
 <file path=word/document.xml><?xml version="1.0" encoding="utf-8"?>
-<w:document xmlns:wpc="http://schemas.microsoft.com/office/word/2010/wordprocessingCanvas" xmlns:cx="http://schemas.microsoft.com/office/drawing/2014/chartex" xmlns:cx1="http://schemas.microsoft.com/office/drawing/2015/9/8/chartex" xmlns:cx2="http://schemas.microsoft.com/office/drawing/2015/10/21/chartex" xmlns:cx3="http://schemas.microsoft.com/office/drawing/2016/5/9/chartex" xmlns:cx4="http://schemas.microsoft.com/office/drawing/2016/5/10/chartex" xmlns:cx5="http://schemas.microsoft.com/office/drawing/2016/5/11/chartex" xmlns:cx6="http://schemas.microsoft.com/office/drawing/2016/5/12/chartex" xmlns:cx7="http://schemas.microsoft.com/office/drawing/2016/5/13/chartex" xmlns:cx8="http://schemas.microsoft.com/office/drawing/2016/5/14/chartex" xmlns:mc="http://schemas.openxmlformats.org/markup-compatibility/2006" xmlns:aink="http://schemas.microsoft.com/office/drawing/2016/ink" xmlns:am3d="http://schemas.microsoft.com/office/drawing/2017/model3d" xmlns:o="urn:schemas-microsoft-com:office:office" xmlns:oel="http://schemas.microsoft.com/office/2019/extlst" xmlns:r="http://schemas.openxmlformats.org/officeDocument/2006/relationships" xmlns:m="http://schemas.openxmlformats.org/officeDocument/2006/math" xmlns:v="urn:schemas-microsoft-com:vml" xmlns:wp14="http://schemas.microsoft.com/office/word/2010/wordprocessingDrawing" xmlns:wp="http://schemas.openxmlformats.org/drawingml/2006/wordprocessingDrawing" xmlns:w10="urn:schemas-microsoft-com:office:word" xmlns:w="http://schemas.openxmlformats.org/wordprocessingml/2006/main" xmlns:w14="http://schemas.microsoft.com/office/word/2010/wordml" xmlns:w15="http://schemas.microsoft.com/office/word/2012/wordml" xmlns:w16cex="http://schemas.microsoft.com/office/word/2018/wordml/cex" xmlns:w16cid="http://schemas.microsoft.com/office/word/2016/wordml/cid" xmlns:w16="http://schemas.microsoft.com/office/word/2018/wordml" xmlns:w16du="http://schemas.microsoft.com/office/word/2023/wordml/word16du" xmlns:w16sdtdh="http://schemas.microsoft.com/office/word/2020/wordml/sdtdatahash" xmlns:w16sdtfl="http://schemas.microsoft.com/office/word/2024/wordml/sdtformatlock" xmlns:w16se="http://schemas.microsoft.com/office/word/2015/wordml/symex" xmlns:wpg="http://schemas.microsoft.com/office/word/2010/wordprocessingGroup" xmlns:wpi="http://schemas.microsoft.com/office/word/2010/wordprocessingInk" xmlns:wne="http://schemas.microsoft.com/office/word/2006/wordml" xmlns:wps="http://schemas.microsoft.com/office/word/2010/wordprocessingShape" mc:Ignorable="w14 w15 w16se w16cid w16 w16cex w16sdtdh w16sdtfl w16du wp14">
+<w:document xmlns:wpc="http://schemas.microsoft.com/office/word/2010/wordprocessingCanvas" xmlns:cx="http://schemas.microsoft.com/office/drawing/2014/chartex" xmlns:cx1="http://schemas.microsoft.com/office/drawing/2015/9/8/chartex" xmlns:cx2="http://schemas.microsoft.com/office/drawing/2015/10/21/chartex" xmlns:cx3="http://schemas.microsoft.com/office/drawing/2016/5/9/chartex" xmlns:cx4="http://schemas.microsoft.com/office/drawing/2016/5/10/chartex" xmlns:cx5="http://schemas.microsoft.com/office/drawing/2016/5/11/chartex" xmlns:cx6="http://schemas.microsoft.com/office/drawing/2016/5/12/chartex" xmlns:cx7="http://schemas.microsoft.com/office/drawing/2016/5/13/chartex" xmlns:cx8="http://schemas.microsoft.com/office/drawing/2016/5/14/chartex" xmlns:mc="http://schemas.openxmlformats.org/markup-compatibility/2006" xmlns:aink="http://schemas.microsoft.com/office/drawing/2016/ink" xmlns:am3d="http://schemas.microsoft.com/office/drawing/2017/model3d" xmlns:o="urn:schemas-microsoft-com:office:office" xmlns:r="http://schemas.openxmlformats.org/officeDocument/2006/relationships" xmlns:m="http://schemas.openxmlformats.org/officeDocument/2006/math" xmlns:v="urn:schemas-microsoft-com:vml" xmlns:wp14="http://schemas.microsoft.com/office/word/2010/wordprocessingDrawing" xmlns:wp="http://schemas.openxmlformats.org/drawingml/2006/wordprocessingDrawing" xmlns:w10="urn:schemas-microsoft-com:office:word" xmlns:w="http://schemas.openxmlformats.org/wordprocessingml/2006/main" xmlns:w14="http://schemas.microsoft.com/office/word/2010/wordml" xmlns:w15="http://schemas.microsoft.com/office/word/2012/wordml" xmlns:w16cex="http://schemas.microsoft.com/office/word/2018/wordml/cex" xmlns:w16cid="http://schemas.microsoft.com/office/word/2016/wordml/cid" xmlns:w16="http://schemas.microsoft.com/office/word/2018/wordml" xmlns:w16sdtdh="http://schemas.microsoft.com/office/word/2020/wordml/sdtdatahash" xmlns:w16se="http://schemas.microsoft.com/office/word/2015/wordml/symex" xmlns:wpg="http://schemas.microsoft.com/office/word/2010/wordprocessingGroup" xmlns:wpi="http://schemas.microsoft.com/office/word/2010/wordprocessingInk" xmlns:wne="http://schemas.microsoft.com/office/word/2006/wordml" xmlns:wps="http://schemas.microsoft.com/office/word/2010/wordprocessingShape" mc:Ignorable="w14 w15 w16se w16cid w16 w16cex w16sdtdh wp14">
   <w:body>
     <w:p>
       <w:pPr>
@@ -53,7 +53,6 @@
                 <w:lang w:val="en-US"/>
               </w:rPr>
             </w:pPr>
-            <w:proofErr w:type="spellStart"/>
             <w:r>
               <w:rPr>
                 <w:rFonts w:ascii="Calibri" w:hAnsi="Calibri" w:cs="Calibri"/>
@@ -63,19 +62,7 @@
                 <w:szCs w:val="28"/>
                 <w:lang w:val="en-US"/>
               </w:rPr>
-              <w:t>Airkrit</w:t>
-            </w:r>
-            <w:proofErr w:type="spellEnd"/>
-            <w:r>
-              <w:rPr>
-                <w:rFonts w:ascii="Calibri" w:hAnsi="Calibri" w:cs="Calibri"/>
-                <w:b/>
-                <w:bCs/>
-                <w:sz w:val="28"/>
-                <w:szCs w:val="28"/>
-                <w:lang w:val="en-US"/>
-              </w:rPr>
-              <w:t xml:space="preserve"> India Pvt. Ltd.</w:t>
+              <w:t>Airkrit India Pvt. Ltd.</w:t>
             </w:r>
           </w:p>
           <w:p>
@@ -198,10 +185,9 @@
               <w:rPr>
                 <w:noProof/>
                 <w:lang w:val="en-US"/>
-                <w14:ligatures w14:val="none"/>
               </w:rPr>
               <w:drawing>
-                <wp:inline distT="0" distB="0" distL="0" distR="0" wp14:anchorId="49216DCA" wp14:editId="227DB048">
+                <wp:inline distT="0" distB="0" distL="0" distR="0" wp14:anchorId="6B3D4AA5" wp14:editId="29657C60">
                   <wp:extent cx="1814833" cy="1286510"/>
                   <wp:effectExtent l="0" t="0" r="1270" b="0"/>
                   <wp:docPr id="1680347720" name="Picture 1" descr="A logo for a company&#10;&#10;AI-generated content may be incorrect."/>
@@ -374,16 +360,6 @@
     </w:p>
     <w:p>
       <w:pPr>
-        <w:rPr>
-          <w:rFonts w:ascii="Calibri" w:eastAsia="Times New Roman" w:hAnsi="Calibri" w:cs="Calibri"/>
-          <w:b/>
-          <w:color w:val="000000"/>
-          <w:lang w:eastAsia="en-IN"/>
-        </w:rPr>
-      </w:pPr>
-    </w:p>
-    <w:p>
-      <w:pPr>
         <w:jc w:val="center"/>
         <w:rPr>
           <w:b/>
@@ -463,29 +439,16 @@
         </w:rPr>
         <w:t>] offered by </w:t>
       </w:r>
-      <w:proofErr w:type="spellStart"/>
-      <w:r>
-        <w:rPr>
-          <w:rFonts w:asciiTheme="minorHAnsi" w:eastAsiaTheme="minorHAnsi" w:hAnsiTheme="minorHAnsi" w:cstheme="minorBidi"/>
-          <w:b/>
-          <w:bCs/>
-          <w:sz w:val="22"/>
-          <w:szCs w:val="22"/>
-          <w:lang w:eastAsia="en-US"/>
-        </w:rPr>
-        <w:t>Airkrit</w:t>
-      </w:r>
-      <w:proofErr w:type="spellEnd"/>
-      <w:r>
-        <w:rPr>
-          <w:rFonts w:asciiTheme="minorHAnsi" w:eastAsiaTheme="minorHAnsi" w:hAnsiTheme="minorHAnsi" w:cstheme="minorBidi"/>
-          <w:b/>
-          <w:bCs/>
-          <w:sz w:val="22"/>
-          <w:szCs w:val="22"/>
-          <w:lang w:eastAsia="en-US"/>
-        </w:rPr>
-        <w:t xml:space="preserve"> Indi</w:t>
+      <w:r>
+        <w:rPr>
+          <w:rFonts w:asciiTheme="minorHAnsi" w:eastAsiaTheme="minorHAnsi" w:hAnsiTheme="minorHAnsi" w:cstheme="minorBidi"/>
+          <w:b/>
+          <w:bCs/>
+          <w:sz w:val="22"/>
+          <w:szCs w:val="22"/>
+          <w:lang w:eastAsia="en-US"/>
+        </w:rPr>
+        <w:t>Airkrit Indi</w:t>
       </w:r>
       <w:r>
         <w:rPr>
@@ -505,7 +468,25 @@
           <w:szCs w:val="22"/>
           <w:lang w:eastAsia="en-US"/>
         </w:rPr>
-        <w:t>. Through this program, [he/she] have acquired essential skills in [</w:t>
+        <w:t xml:space="preserve">. Through this program, </w:t>
+      </w:r>
+      <w:r>
+        <w:rPr>
+          <w:rFonts w:asciiTheme="minorHAnsi" w:eastAsiaTheme="minorHAnsi" w:hAnsiTheme="minorHAnsi" w:cstheme="minorBidi"/>
+          <w:sz w:val="22"/>
+          <w:szCs w:val="22"/>
+          <w:lang w:eastAsia="en-US"/>
+        </w:rPr>
+        <w:t>they</w:t>
+      </w:r>
+      <w:r>
+        <w:rPr>
+          <w:rFonts w:asciiTheme="minorHAnsi" w:eastAsiaTheme="minorHAnsi" w:hAnsiTheme="minorHAnsi" w:cstheme="minorBidi"/>
+          <w:sz w:val="22"/>
+          <w:szCs w:val="22"/>
+          <w:lang w:eastAsia="en-US"/>
+        </w:rPr>
+        <w:t xml:space="preserve"> have acquired essential skills in [</w:t>
       </w:r>
       <w:r>
         <w:rPr>
@@ -576,7 +557,25 @@
           <w:szCs w:val="22"/>
           <w:lang w:eastAsia="en-US"/>
         </w:rPr>
-        <w:t>] engaged actively with our structured curriculum, including live sessions, mentorship interactions, and self-paced content. The training emphasized practical application of concepts, preparing [him/her] for future opportunities in the tech industry.</w:t>
+        <w:t xml:space="preserve">] engaged actively with our structured curriculum, including live sessions, mentorship interactions, and self-paced content. The training emphasized practical application of concepts, preparing </w:t>
+      </w:r>
+      <w:r>
+        <w:rPr>
+          <w:rFonts w:asciiTheme="minorHAnsi" w:eastAsiaTheme="minorHAnsi" w:hAnsiTheme="minorHAnsi" w:cstheme="minorBidi"/>
+          <w:sz w:val="22"/>
+          <w:szCs w:val="22"/>
+          <w:lang w:eastAsia="en-US"/>
+        </w:rPr>
+        <w:t>them</w:t>
+      </w:r>
+      <w:r>
+        <w:rPr>
+          <w:rFonts w:asciiTheme="minorHAnsi" w:eastAsiaTheme="minorHAnsi" w:hAnsiTheme="minorHAnsi" w:cstheme="minorBidi"/>
+          <w:sz w:val="22"/>
+          <w:szCs w:val="22"/>
+          <w:lang w:eastAsia="en-US"/>
+        </w:rPr>
+        <w:t xml:space="preserve"> for future opportunities in the tech industry.</w:t>
       </w:r>
     </w:p>
     <w:p>
@@ -596,16 +595,16 @@
           <w:szCs w:val="22"/>
           <w:lang w:eastAsia="en-US"/>
         </w:rPr>
-        <w:t>We acknowledge [his/her</w:t>
-      </w:r>
-      <w:r>
-        <w:rPr>
-          <w:rFonts w:asciiTheme="minorHAnsi" w:eastAsiaTheme="minorHAnsi" w:hAnsiTheme="minorHAnsi" w:cstheme="minorBidi"/>
-          <w:sz w:val="22"/>
-          <w:szCs w:val="22"/>
-          <w:lang w:eastAsia="en-US"/>
-        </w:rPr>
-        <w:t>]</w:t>
+        <w:t xml:space="preserve">We acknowledge </w:t>
+      </w:r>
+      <w:r>
+        <w:rPr>
+          <w:rFonts w:asciiTheme="minorHAnsi" w:eastAsiaTheme="minorHAnsi" w:hAnsiTheme="minorHAnsi" w:cstheme="minorBidi"/>
+          <w:sz w:val="22"/>
+          <w:szCs w:val="22"/>
+          <w:lang w:eastAsia="en-US"/>
+        </w:rPr>
+        <w:t>their</w:t>
       </w:r>
       <w:r>
         <w:rPr>
@@ -665,7 +664,7 @@
           <w:noProof/>
         </w:rPr>
         <w:drawing>
-          <wp:inline distT="0" distB="0" distL="0" distR="0" wp14:anchorId="7D245EBF" wp14:editId="7753B15B">
+          <wp:inline distT="0" distB="0" distL="0" distR="0" wp14:anchorId="35614006" wp14:editId="6EE1F527">
             <wp:extent cx="1955800" cy="1397000"/>
             <wp:effectExtent l="0" t="0" r="0" b="0"/>
             <wp:docPr id="1559720406" name="Picture 1"/>
@@ -853,7 +852,7 @@
 </file>
 
 <file path=word/endnotes.xml><?xml version="1.0" encoding="utf-8"?>
-<w:endnotes xmlns:wpc="http://schemas.microsoft.com/office/word/2010/wordprocessingCanvas" xmlns:cx="http://schemas.microsoft.com/office/drawing/2014/chartex" xmlns:cx1="http://schemas.microsoft.com/office/drawing/2015/9/8/chartex" xmlns:cx2="http://schemas.microsoft.com/office/drawing/2015/10/21/chartex" xmlns:cx3="http://schemas.microsoft.com/office/drawing/2016/5/9/chartex" xmlns:cx4="http://schemas.microsoft.com/office/drawing/2016/5/10/chartex" xmlns:cx5="http://schemas.microsoft.com/office/drawing/2016/5/11/chartex" xmlns:cx6="http://schemas.microsoft.com/office/drawing/2016/5/12/chartex" xmlns:cx7="http://schemas.microsoft.com/office/drawing/2016/5/13/chartex" xmlns:cx8="http://schemas.microsoft.com/office/drawing/2016/5/14/chartex" xmlns:mc="http://schemas.openxmlformats.org/markup-compatibility/2006" xmlns:aink="http://schemas.microsoft.com/office/drawing/2016/ink" xmlns:am3d="http://schemas.microsoft.com/office/drawing/2017/model3d" xmlns:o="urn:schemas-microsoft-com:office:office" xmlns:oel="http://schemas.microsoft.com/office/2019/extlst" xmlns:r="http://schemas.openxmlformats.org/officeDocument/2006/relationships" xmlns:m="http://schemas.openxmlformats.org/officeDocument/2006/math" xmlns:v="urn:schemas-microsoft-com:vml" xmlns:wp14="http://schemas.microsoft.com/office/word/2010/wordprocessingDrawing" xmlns:wp="http://schemas.openxmlformats.org/drawingml/2006/wordprocessingDrawing" xmlns:w10="urn:schemas-microsoft-com:office:word" xmlns:w="http://schemas.openxmlformats.org/wordprocessingml/2006/main" xmlns:w14="http://schemas.microsoft.com/office/word/2010/wordml" xmlns:w15="http://schemas.microsoft.com/office/word/2012/wordml" xmlns:w16cex="http://schemas.microsoft.com/office/word/2018/wordml/cex" xmlns:w16cid="http://schemas.microsoft.com/office/word/2016/wordml/cid" xmlns:w16="http://schemas.microsoft.com/office/word/2018/wordml" xmlns:w16du="http://schemas.microsoft.com/office/word/2023/wordml/word16du" xmlns:w16sdtdh="http://schemas.microsoft.com/office/word/2020/wordml/sdtdatahash" xmlns:w16sdtfl="http://schemas.microsoft.com/office/word/2024/wordml/sdtformatlock" xmlns:w16se="http://schemas.microsoft.com/office/word/2015/wordml/symex" xmlns:wpg="http://schemas.microsoft.com/office/word/2010/wordprocessingGroup" xmlns:wpi="http://schemas.microsoft.com/office/word/2010/wordprocessingInk" xmlns:wne="http://schemas.microsoft.com/office/word/2006/wordml" xmlns:wps="http://schemas.microsoft.com/office/word/2010/wordprocessingShape" mc:Ignorable="w14 w15 w16se w16cid w16 w16cex w16sdtdh w16sdtfl w16du wp14">
+<w:endnotes xmlns:wpc="http://schemas.microsoft.com/office/word/2010/wordprocessingCanvas" xmlns:cx="http://schemas.microsoft.com/office/drawing/2014/chartex" xmlns:cx1="http://schemas.microsoft.com/office/drawing/2015/9/8/chartex" xmlns:cx2="http://schemas.microsoft.com/office/drawing/2015/10/21/chartex" xmlns:cx3="http://schemas.microsoft.com/office/drawing/2016/5/9/chartex" xmlns:cx4="http://schemas.microsoft.com/office/drawing/2016/5/10/chartex" xmlns:cx5="http://schemas.microsoft.com/office/drawing/2016/5/11/chartex" xmlns:cx6="http://schemas.microsoft.com/office/drawing/2016/5/12/chartex" xmlns:cx7="http://schemas.microsoft.com/office/drawing/2016/5/13/chartex" xmlns:cx8="http://schemas.microsoft.com/office/drawing/2016/5/14/chartex" xmlns:mc="http://schemas.openxmlformats.org/markup-compatibility/2006" xmlns:aink="http://schemas.microsoft.com/office/drawing/2016/ink" xmlns:am3d="http://schemas.microsoft.com/office/drawing/2017/model3d" xmlns:o="urn:schemas-microsoft-com:office:office" xmlns:r="http://schemas.openxmlformats.org/officeDocument/2006/relationships" xmlns:m="http://schemas.openxmlformats.org/officeDocument/2006/math" xmlns:v="urn:schemas-microsoft-com:vml" xmlns:wp14="http://schemas.microsoft.com/office/word/2010/wordprocessingDrawing" xmlns:wp="http://schemas.openxmlformats.org/drawingml/2006/wordprocessingDrawing" xmlns:w10="urn:schemas-microsoft-com:office:word" xmlns:w="http://schemas.openxmlformats.org/wordprocessingml/2006/main" xmlns:w14="http://schemas.microsoft.com/office/word/2010/wordml" xmlns:w15="http://schemas.microsoft.com/office/word/2012/wordml" xmlns:w16cex="http://schemas.microsoft.com/office/word/2018/wordml/cex" xmlns:w16cid="http://schemas.microsoft.com/office/word/2016/wordml/cid" xmlns:w16="http://schemas.microsoft.com/office/word/2018/wordml" xmlns:w16sdtdh="http://schemas.microsoft.com/office/word/2020/wordml/sdtdatahash" xmlns:w16se="http://schemas.microsoft.com/office/word/2015/wordml/symex" xmlns:wpg="http://schemas.microsoft.com/office/word/2010/wordprocessingGroup" xmlns:wpi="http://schemas.microsoft.com/office/word/2010/wordprocessingInk" xmlns:wne="http://schemas.microsoft.com/office/word/2006/wordml" xmlns:wps="http://schemas.microsoft.com/office/word/2010/wordprocessingShape" mc:Ignorable="w14 w15 w16se w16cid w16 w16cex w16sdtdh wp14">
   <w:endnote w:type="separator" w:id="-1">
     <w:p>
       <w:pPr>
@@ -878,7 +877,7 @@
 </file>
 
 <file path=word/footer1.xml><?xml version="1.0" encoding="utf-8"?>
-<w:ftr xmlns:wpc="http://schemas.microsoft.com/office/word/2010/wordprocessingCanvas" xmlns:cx="http://schemas.microsoft.com/office/drawing/2014/chartex" xmlns:cx1="http://schemas.microsoft.com/office/drawing/2015/9/8/chartex" xmlns:cx2="http://schemas.microsoft.com/office/drawing/2015/10/21/chartex" xmlns:cx3="http://schemas.microsoft.com/office/drawing/2016/5/9/chartex" xmlns:cx4="http://schemas.microsoft.com/office/drawing/2016/5/10/chartex" xmlns:cx5="http://schemas.microsoft.com/office/drawing/2016/5/11/chartex" xmlns:cx6="http://schemas.microsoft.com/office/drawing/2016/5/12/chartex" xmlns:cx7="http://schemas.microsoft.com/office/drawing/2016/5/13/chartex" xmlns:cx8="http://schemas.microsoft.com/office/drawing/2016/5/14/chartex" xmlns:mc="http://schemas.openxmlformats.org/markup-compatibility/2006" xmlns:aink="http://schemas.microsoft.com/office/drawing/2016/ink" xmlns:am3d="http://schemas.microsoft.com/office/drawing/2017/model3d" xmlns:o="urn:schemas-microsoft-com:office:office" xmlns:oel="http://schemas.microsoft.com/office/2019/extlst" xmlns:r="http://schemas.openxmlformats.org/officeDocument/2006/relationships" xmlns:m="http://schemas.openxmlformats.org/officeDocument/2006/math" xmlns:v="urn:schemas-microsoft-com:vml" xmlns:wp14="http://schemas.microsoft.com/office/word/2010/wordprocessingDrawing" xmlns:wp="http://schemas.openxmlformats.org/drawingml/2006/wordprocessingDrawing" xmlns:w10="urn:schemas-microsoft-com:office:word" xmlns:w="http://schemas.openxmlformats.org/wordprocessingml/2006/main" xmlns:w14="http://schemas.microsoft.com/office/word/2010/wordml" xmlns:w15="http://schemas.microsoft.com/office/word/2012/wordml" xmlns:w16cex="http://schemas.microsoft.com/office/word/2018/wordml/cex" xmlns:w16cid="http://schemas.microsoft.com/office/word/2016/wordml/cid" xmlns:w16="http://schemas.microsoft.com/office/word/2018/wordml" xmlns:w16du="http://schemas.microsoft.com/office/word/2023/wordml/word16du" xmlns:w16sdtdh="http://schemas.microsoft.com/office/word/2020/wordml/sdtdatahash" xmlns:w16sdtfl="http://schemas.microsoft.com/office/word/2024/wordml/sdtformatlock" xmlns:w16se="http://schemas.microsoft.com/office/word/2015/wordml/symex" xmlns:wpg="http://schemas.microsoft.com/office/word/2010/wordprocessingGroup" xmlns:wpi="http://schemas.microsoft.com/office/word/2010/wordprocessingInk" xmlns:wne="http://schemas.microsoft.com/office/word/2006/wordml" xmlns:wps="http://schemas.microsoft.com/office/word/2010/wordprocessingShape" mc:Ignorable="w14 w15 w16se w16cid w16 w16cex w16sdtdh w16sdtfl w16du wp14">
+<w:ftr xmlns:wpc="http://schemas.microsoft.com/office/word/2010/wordprocessingCanvas" xmlns:cx="http://schemas.microsoft.com/office/drawing/2014/chartex" xmlns:cx1="http://schemas.microsoft.com/office/drawing/2015/9/8/chartex" xmlns:cx2="http://schemas.microsoft.com/office/drawing/2015/10/21/chartex" xmlns:cx3="http://schemas.microsoft.com/office/drawing/2016/5/9/chartex" xmlns:cx4="http://schemas.microsoft.com/office/drawing/2016/5/10/chartex" xmlns:cx5="http://schemas.microsoft.com/office/drawing/2016/5/11/chartex" xmlns:cx6="http://schemas.microsoft.com/office/drawing/2016/5/12/chartex" xmlns:cx7="http://schemas.microsoft.com/office/drawing/2016/5/13/chartex" xmlns:cx8="http://schemas.microsoft.com/office/drawing/2016/5/14/chartex" xmlns:mc="http://schemas.openxmlformats.org/markup-compatibility/2006" xmlns:aink="http://schemas.microsoft.com/office/drawing/2016/ink" xmlns:am3d="http://schemas.microsoft.com/office/drawing/2017/model3d" xmlns:o="urn:schemas-microsoft-com:office:office" xmlns:r="http://schemas.openxmlformats.org/officeDocument/2006/relationships" xmlns:m="http://schemas.openxmlformats.org/officeDocument/2006/math" xmlns:v="urn:schemas-microsoft-com:vml" xmlns:wp14="http://schemas.microsoft.com/office/word/2010/wordprocessingDrawing" xmlns:wp="http://schemas.openxmlformats.org/drawingml/2006/wordprocessingDrawing" xmlns:w10="urn:schemas-microsoft-com:office:word" xmlns:w="http://schemas.openxmlformats.org/wordprocessingml/2006/main" xmlns:w14="http://schemas.microsoft.com/office/word/2010/wordml" xmlns:w15="http://schemas.microsoft.com/office/word/2012/wordml" xmlns:w16cex="http://schemas.microsoft.com/office/word/2018/wordml/cex" xmlns:w16cid="http://schemas.microsoft.com/office/word/2016/wordml/cid" xmlns:w16="http://schemas.microsoft.com/office/word/2018/wordml" xmlns:w16sdtdh="http://schemas.microsoft.com/office/word/2020/wordml/sdtdatahash" xmlns:w16se="http://schemas.microsoft.com/office/word/2015/wordml/symex" xmlns:wpg="http://schemas.microsoft.com/office/word/2010/wordprocessingGroup" xmlns:wpi="http://schemas.microsoft.com/office/word/2010/wordprocessingInk" xmlns:wne="http://schemas.microsoft.com/office/word/2006/wordml" xmlns:wps="http://schemas.microsoft.com/office/word/2010/wordprocessingShape" mc:Ignorable="w14 w15 w16se w16cid w16 w16cex w16sdtdh wp14">
   <w:p>
     <w:pPr>
       <w:pStyle w:val="Footer"/>
@@ -888,7 +887,7 @@
 </file>
 
 <file path=word/footer2.xml><?xml version="1.0" encoding="utf-8"?>
-<w:ftr xmlns:wpc="http://schemas.microsoft.com/office/word/2010/wordprocessingCanvas" xmlns:cx="http://schemas.microsoft.com/office/drawing/2014/chartex" xmlns:cx1="http://schemas.microsoft.com/office/drawing/2015/9/8/chartex" xmlns:cx2="http://schemas.microsoft.com/office/drawing/2015/10/21/chartex" xmlns:cx3="http://schemas.microsoft.com/office/drawing/2016/5/9/chartex" xmlns:cx4="http://schemas.microsoft.com/office/drawing/2016/5/10/chartex" xmlns:cx5="http://schemas.microsoft.com/office/drawing/2016/5/11/chartex" xmlns:cx6="http://schemas.microsoft.com/office/drawing/2016/5/12/chartex" xmlns:cx7="http://schemas.microsoft.com/office/drawing/2016/5/13/chartex" xmlns:cx8="http://schemas.microsoft.com/office/drawing/2016/5/14/chartex" xmlns:mc="http://schemas.openxmlformats.org/markup-compatibility/2006" xmlns:aink="http://schemas.microsoft.com/office/drawing/2016/ink" xmlns:am3d="http://schemas.microsoft.com/office/drawing/2017/model3d" xmlns:o="urn:schemas-microsoft-com:office:office" xmlns:oel="http://schemas.microsoft.com/office/2019/extlst" xmlns:r="http://schemas.openxmlformats.org/officeDocument/2006/relationships" xmlns:m="http://schemas.openxmlformats.org/officeDocument/2006/math" xmlns:v="urn:schemas-microsoft-com:vml" xmlns:wp14="http://schemas.microsoft.com/office/word/2010/wordprocessingDrawing" xmlns:wp="http://schemas.openxmlformats.org/drawingml/2006/wordprocessingDrawing" xmlns:w10="urn:schemas-microsoft-com:office:word" xmlns:w="http://schemas.openxmlformats.org/wordprocessingml/2006/main" xmlns:w14="http://schemas.microsoft.com/office/word/2010/wordml" xmlns:w15="http://schemas.microsoft.com/office/word/2012/wordml" xmlns:w16cex="http://schemas.microsoft.com/office/word/2018/wordml/cex" xmlns:w16cid="http://schemas.microsoft.com/office/word/2016/wordml/cid" xmlns:w16="http://schemas.microsoft.com/office/word/2018/wordml" xmlns:w16du="http://schemas.microsoft.com/office/word/2023/wordml/word16du" xmlns:w16sdtdh="http://schemas.microsoft.com/office/word/2020/wordml/sdtdatahash" xmlns:w16sdtfl="http://schemas.microsoft.com/office/word/2024/wordml/sdtformatlock" xmlns:w16se="http://schemas.microsoft.com/office/word/2015/wordml/symex" xmlns:wpg="http://schemas.microsoft.com/office/word/2010/wordprocessingGroup" xmlns:wpi="http://schemas.microsoft.com/office/word/2010/wordprocessingInk" xmlns:wne="http://schemas.microsoft.com/office/word/2006/wordml" xmlns:wps="http://schemas.microsoft.com/office/word/2010/wordprocessingShape" mc:Ignorable="w14 w15 w16se w16cid w16 w16cex w16sdtdh w16sdtfl w16du wp14">
+<w:ftr xmlns:wpc="http://schemas.microsoft.com/office/word/2010/wordprocessingCanvas" xmlns:cx="http://schemas.microsoft.com/office/drawing/2014/chartex" xmlns:cx1="http://schemas.microsoft.com/office/drawing/2015/9/8/chartex" xmlns:cx2="http://schemas.microsoft.com/office/drawing/2015/10/21/chartex" xmlns:cx3="http://schemas.microsoft.com/office/drawing/2016/5/9/chartex" xmlns:cx4="http://schemas.microsoft.com/office/drawing/2016/5/10/chartex" xmlns:cx5="http://schemas.microsoft.com/office/drawing/2016/5/11/chartex" xmlns:cx6="http://schemas.microsoft.com/office/drawing/2016/5/12/chartex" xmlns:cx7="http://schemas.microsoft.com/office/drawing/2016/5/13/chartex" xmlns:cx8="http://schemas.microsoft.com/office/drawing/2016/5/14/chartex" xmlns:mc="http://schemas.openxmlformats.org/markup-compatibility/2006" xmlns:aink="http://schemas.microsoft.com/office/drawing/2016/ink" xmlns:am3d="http://schemas.microsoft.com/office/drawing/2017/model3d" xmlns:o="urn:schemas-microsoft-com:office:office" xmlns:r="http://schemas.openxmlformats.org/officeDocument/2006/relationships" xmlns:m="http://schemas.openxmlformats.org/officeDocument/2006/math" xmlns:v="urn:schemas-microsoft-com:vml" xmlns:wp14="http://schemas.microsoft.com/office/word/2010/wordprocessingDrawing" xmlns:wp="http://schemas.openxmlformats.org/drawingml/2006/wordprocessingDrawing" xmlns:w10="urn:schemas-microsoft-com:office:word" xmlns:w="http://schemas.openxmlformats.org/wordprocessingml/2006/main" xmlns:w14="http://schemas.microsoft.com/office/word/2010/wordml" xmlns:w15="http://schemas.microsoft.com/office/word/2012/wordml" xmlns:w16cex="http://schemas.microsoft.com/office/word/2018/wordml/cex" xmlns:w16cid="http://schemas.microsoft.com/office/word/2016/wordml/cid" xmlns:w16="http://schemas.microsoft.com/office/word/2018/wordml" xmlns:w16sdtdh="http://schemas.microsoft.com/office/word/2020/wordml/sdtdatahash" xmlns:w16se="http://schemas.microsoft.com/office/word/2015/wordml/symex" xmlns:wpg="http://schemas.microsoft.com/office/word/2010/wordprocessingGroup" xmlns:wpi="http://schemas.microsoft.com/office/word/2010/wordprocessingInk" xmlns:wne="http://schemas.microsoft.com/office/word/2006/wordml" xmlns:wps="http://schemas.microsoft.com/office/word/2010/wordprocessingShape" mc:Ignorable="w14 w15 w16se w16cid w16 w16cex w16sdtdh wp14">
   <w:p>
     <w:pPr>
       <w:pStyle w:val="Footer"/>
@@ -898,7 +897,7 @@
 </file>
 
 <file path=word/footer3.xml><?xml version="1.0" encoding="utf-8"?>
-<w:ftr xmlns:wpc="http://schemas.microsoft.com/office/word/2010/wordprocessingCanvas" xmlns:cx="http://schemas.microsoft.com/office/drawing/2014/chartex" xmlns:cx1="http://schemas.microsoft.com/office/drawing/2015/9/8/chartex" xmlns:cx2="http://schemas.microsoft.com/office/drawing/2015/10/21/chartex" xmlns:cx3="http://schemas.microsoft.com/office/drawing/2016/5/9/chartex" xmlns:cx4="http://schemas.microsoft.com/office/drawing/2016/5/10/chartex" xmlns:cx5="http://schemas.microsoft.com/office/drawing/2016/5/11/chartex" xmlns:cx6="http://schemas.microsoft.com/office/drawing/2016/5/12/chartex" xmlns:cx7="http://schemas.microsoft.com/office/drawing/2016/5/13/chartex" xmlns:cx8="http://schemas.microsoft.com/office/drawing/2016/5/14/chartex" xmlns:mc="http://schemas.openxmlformats.org/markup-compatibility/2006" xmlns:aink="http://schemas.microsoft.com/office/drawing/2016/ink" xmlns:am3d="http://schemas.microsoft.com/office/drawing/2017/model3d" xmlns:o="urn:schemas-microsoft-com:office:office" xmlns:oel="http://schemas.microsoft.com/office/2019/extlst" xmlns:r="http://schemas.openxmlformats.org/officeDocument/2006/relationships" xmlns:m="http://schemas.openxmlformats.org/officeDocument/2006/math" xmlns:v="urn:schemas-microsoft-com:vml" xmlns:wp14="http://schemas.microsoft.com/office/word/2010/wordprocessingDrawing" xmlns:wp="http://schemas.openxmlformats.org/drawingml/2006/wordprocessingDrawing" xmlns:w10="urn:schemas-microsoft-com:office:word" xmlns:w="http://schemas.openxmlformats.org/wordprocessingml/2006/main" xmlns:w14="http://schemas.microsoft.com/office/word/2010/wordml" xmlns:w15="http://schemas.microsoft.com/office/word/2012/wordml" xmlns:w16cex="http://schemas.microsoft.com/office/word/2018/wordml/cex" xmlns:w16cid="http://schemas.microsoft.com/office/word/2016/wordml/cid" xmlns:w16="http://schemas.microsoft.com/office/word/2018/wordml" xmlns:w16du="http://schemas.microsoft.com/office/word/2023/wordml/word16du" xmlns:w16sdtdh="http://schemas.microsoft.com/office/word/2020/wordml/sdtdatahash" xmlns:w16sdtfl="http://schemas.microsoft.com/office/word/2024/wordml/sdtformatlock" xmlns:w16se="http://schemas.microsoft.com/office/word/2015/wordml/symex" xmlns:wpg="http://schemas.microsoft.com/office/word/2010/wordprocessingGroup" xmlns:wpi="http://schemas.microsoft.com/office/word/2010/wordprocessingInk" xmlns:wne="http://schemas.microsoft.com/office/word/2006/wordml" xmlns:wps="http://schemas.microsoft.com/office/word/2010/wordprocessingShape" mc:Ignorable="w14 w15 w16se w16cid w16 w16cex w16sdtdh w16sdtfl w16du wp14">
+<w:ftr xmlns:wpc="http://schemas.microsoft.com/office/word/2010/wordprocessingCanvas" xmlns:cx="http://schemas.microsoft.com/office/drawing/2014/chartex" xmlns:cx1="http://schemas.microsoft.com/office/drawing/2015/9/8/chartex" xmlns:cx2="http://schemas.microsoft.com/office/drawing/2015/10/21/chartex" xmlns:cx3="http://schemas.microsoft.com/office/drawing/2016/5/9/chartex" xmlns:cx4="http://schemas.microsoft.com/office/drawing/2016/5/10/chartex" xmlns:cx5="http://schemas.microsoft.com/office/drawing/2016/5/11/chartex" xmlns:cx6="http://schemas.microsoft.com/office/drawing/2016/5/12/chartex" xmlns:cx7="http://schemas.microsoft.com/office/drawing/2016/5/13/chartex" xmlns:cx8="http://schemas.microsoft.com/office/drawing/2016/5/14/chartex" xmlns:mc="http://schemas.openxmlformats.org/markup-compatibility/2006" xmlns:aink="http://schemas.microsoft.com/office/drawing/2016/ink" xmlns:am3d="http://schemas.microsoft.com/office/drawing/2017/model3d" xmlns:o="urn:schemas-microsoft-com:office:office" xmlns:r="http://schemas.openxmlformats.org/officeDocument/2006/relationships" xmlns:m="http://schemas.openxmlformats.org/officeDocument/2006/math" xmlns:v="urn:schemas-microsoft-com:vml" xmlns:wp14="http://schemas.microsoft.com/office/word/2010/wordprocessingDrawing" xmlns:wp="http://schemas.openxmlformats.org/drawingml/2006/wordprocessingDrawing" xmlns:w10="urn:schemas-microsoft-com:office:word" xmlns:w="http://schemas.openxmlformats.org/wordprocessingml/2006/main" xmlns:w14="http://schemas.microsoft.com/office/word/2010/wordml" xmlns:w15="http://schemas.microsoft.com/office/word/2012/wordml" xmlns:w16cex="http://schemas.microsoft.com/office/word/2018/wordml/cex" xmlns:w16cid="http://schemas.microsoft.com/office/word/2016/wordml/cid" xmlns:w16="http://schemas.microsoft.com/office/word/2018/wordml" xmlns:w16sdtdh="http://schemas.microsoft.com/office/word/2020/wordml/sdtdatahash" xmlns:w16se="http://schemas.microsoft.com/office/word/2015/wordml/symex" xmlns:wpg="http://schemas.microsoft.com/office/word/2010/wordprocessingGroup" xmlns:wpi="http://schemas.microsoft.com/office/word/2010/wordprocessingInk" xmlns:wne="http://schemas.microsoft.com/office/word/2006/wordml" xmlns:wps="http://schemas.microsoft.com/office/word/2010/wordprocessingShape" mc:Ignorable="w14 w15 w16se w16cid w16 w16cex w16sdtdh wp14">
   <w:p>
     <w:pPr>
       <w:pStyle w:val="Footer"/>
@@ -908,7 +907,7 @@
 </file>
 
 <file path=word/footnotes.xml><?xml version="1.0" encoding="utf-8"?>
-<w:footnotes xmlns:wpc="http://schemas.microsoft.com/office/word/2010/wordprocessingCanvas" xmlns:cx="http://schemas.microsoft.com/office/drawing/2014/chartex" xmlns:cx1="http://schemas.microsoft.com/office/drawing/2015/9/8/chartex" xmlns:cx2="http://schemas.microsoft.com/office/drawing/2015/10/21/chartex" xmlns:cx3="http://schemas.microsoft.com/office/drawing/2016/5/9/chartex" xmlns:cx4="http://schemas.microsoft.com/office/drawing/2016/5/10/chartex" xmlns:cx5="http://schemas.microsoft.com/office/drawing/2016/5/11/chartex" xmlns:cx6="http://schemas.microsoft.com/office/drawing/2016/5/12/chartex" xmlns:cx7="http://schemas.microsoft.com/office/drawing/2016/5/13/chartex" xmlns:cx8="http://schemas.microsoft.com/office/drawing/2016/5/14/chartex" xmlns:mc="http://schemas.openxmlformats.org/markup-compatibility/2006" xmlns:aink="http://schemas.microsoft.com/office/drawing/2016/ink" xmlns:am3d="http://schemas.microsoft.com/office/drawing/2017/model3d" xmlns:o="urn:schemas-microsoft-com:office:office" xmlns:oel="http://schemas.microsoft.com/office/2019/extlst" xmlns:r="http://schemas.openxmlformats.org/officeDocument/2006/relationships" xmlns:m="http://schemas.openxmlformats.org/officeDocument/2006/math" xmlns:v="urn:schemas-microsoft-com:vml" xmlns:wp14="http://schemas.microsoft.com/office/word/2010/wordprocessingDrawing" xmlns:wp="http://schemas.openxmlformats.org/drawingml/2006/wordprocessingDrawing" xmlns:w10="urn:schemas-microsoft-com:office:word" xmlns:w="http://schemas.openxmlformats.org/wordprocessingml/2006/main" xmlns:w14="http://schemas.microsoft.com/office/word/2010/wordml" xmlns:w15="http://schemas.microsoft.com/office/word/2012/wordml" xmlns:w16cex="http://schemas.microsoft.com/office/word/2018/wordml/cex" xmlns:w16cid="http://schemas.microsoft.com/office/word/2016/wordml/cid" xmlns:w16="http://schemas.microsoft.com/office/word/2018/wordml" xmlns:w16du="http://schemas.microsoft.com/office/word/2023/wordml/word16du" xmlns:w16sdtdh="http://schemas.microsoft.com/office/word/2020/wordml/sdtdatahash" xmlns:w16sdtfl="http://schemas.microsoft.com/office/word/2024/wordml/sdtformatlock" xmlns:w16se="http://schemas.microsoft.com/office/word/2015/wordml/symex" xmlns:wpg="http://schemas.microsoft.com/office/word/2010/wordprocessingGroup" xmlns:wpi="http://schemas.microsoft.com/office/word/2010/wordprocessingInk" xmlns:wne="http://schemas.microsoft.com/office/word/2006/wordml" xmlns:wps="http://schemas.microsoft.com/office/word/2010/wordprocessingShape" mc:Ignorable="w14 w15 w16se w16cid w16 w16cex w16sdtdh w16sdtfl w16du wp14">
+<w:footnotes xmlns:wpc="http://schemas.microsoft.com/office/word/2010/wordprocessingCanvas" xmlns:cx="http://schemas.microsoft.com/office/drawing/2014/chartex" xmlns:cx1="http://schemas.microsoft.com/office/drawing/2015/9/8/chartex" xmlns:cx2="http://schemas.microsoft.com/office/drawing/2015/10/21/chartex" xmlns:cx3="http://schemas.microsoft.com/office/drawing/2016/5/9/chartex" xmlns:cx4="http://schemas.microsoft.com/office/drawing/2016/5/10/chartex" xmlns:cx5="http://schemas.microsoft.com/office/drawing/2016/5/11/chartex" xmlns:cx6="http://schemas.microsoft.com/office/drawing/2016/5/12/chartex" xmlns:cx7="http://schemas.microsoft.com/office/drawing/2016/5/13/chartex" xmlns:cx8="http://schemas.microsoft.com/office/drawing/2016/5/14/chartex" xmlns:mc="http://schemas.openxmlformats.org/markup-compatibility/2006" xmlns:aink="http://schemas.microsoft.com/office/drawing/2016/ink" xmlns:am3d="http://schemas.microsoft.com/office/drawing/2017/model3d" xmlns:o="urn:schemas-microsoft-com:office:office" xmlns:r="http://schemas.openxmlformats.org/officeDocument/2006/relationships" xmlns:m="http://schemas.openxmlformats.org/officeDocument/2006/math" xmlns:v="urn:schemas-microsoft-com:vml" xmlns:wp14="http://schemas.microsoft.com/office/word/2010/wordprocessingDrawing" xmlns:wp="http://schemas.openxmlformats.org/drawingml/2006/wordprocessingDrawing" xmlns:w10="urn:schemas-microsoft-com:office:word" xmlns:w="http://schemas.openxmlformats.org/wordprocessingml/2006/main" xmlns:w14="http://schemas.microsoft.com/office/word/2010/wordml" xmlns:w15="http://schemas.microsoft.com/office/word/2012/wordml" xmlns:w16cex="http://schemas.microsoft.com/office/word/2018/wordml/cex" xmlns:w16cid="http://schemas.microsoft.com/office/word/2016/wordml/cid" xmlns:w16="http://schemas.microsoft.com/office/word/2018/wordml" xmlns:w16sdtdh="http://schemas.microsoft.com/office/word/2020/wordml/sdtdatahash" xmlns:w16se="http://schemas.microsoft.com/office/word/2015/wordml/symex" xmlns:wpg="http://schemas.microsoft.com/office/word/2010/wordprocessingGroup" xmlns:wpi="http://schemas.microsoft.com/office/word/2010/wordprocessingInk" xmlns:wne="http://schemas.microsoft.com/office/word/2006/wordml" xmlns:wps="http://schemas.microsoft.com/office/word/2010/wordprocessingShape" mc:Ignorable="w14 w15 w16se w16cid w16 w16cex w16sdtdh wp14">
   <w:footnote w:type="separator" w:id="-1">
     <w:p>
       <w:pPr>
@@ -933,7 +932,7 @@
 </file>
 
 <file path=word/header1.xml><?xml version="1.0" encoding="utf-8"?>
-<w:hdr xmlns:wpc="http://schemas.microsoft.com/office/word/2010/wordprocessingCanvas" xmlns:cx="http://schemas.microsoft.com/office/drawing/2014/chartex" xmlns:cx1="http://schemas.microsoft.com/office/drawing/2015/9/8/chartex" xmlns:cx2="http://schemas.microsoft.com/office/drawing/2015/10/21/chartex" xmlns:cx3="http://schemas.microsoft.com/office/drawing/2016/5/9/chartex" xmlns:cx4="http://schemas.microsoft.com/office/drawing/2016/5/10/chartex" xmlns:cx5="http://schemas.microsoft.com/office/drawing/2016/5/11/chartex" xmlns:cx6="http://schemas.microsoft.com/office/drawing/2016/5/12/chartex" xmlns:cx7="http://schemas.microsoft.com/office/drawing/2016/5/13/chartex" xmlns:cx8="http://schemas.microsoft.com/office/drawing/2016/5/14/chartex" xmlns:mc="http://schemas.openxmlformats.org/markup-compatibility/2006" xmlns:aink="http://schemas.microsoft.com/office/drawing/2016/ink" xmlns:am3d="http://schemas.microsoft.com/office/drawing/2017/model3d" xmlns:o="urn:schemas-microsoft-com:office:office" xmlns:oel="http://schemas.microsoft.com/office/2019/extlst" xmlns:r="http://schemas.openxmlformats.org/officeDocument/2006/relationships" xmlns:m="http://schemas.openxmlformats.org/officeDocument/2006/math" xmlns:v="urn:schemas-microsoft-com:vml" xmlns:wp14="http://schemas.microsoft.com/office/word/2010/wordprocessingDrawing" xmlns:wp="http://schemas.openxmlformats.org/drawingml/2006/wordprocessingDrawing" xmlns:w10="urn:schemas-microsoft-com:office:word" xmlns:w="http://schemas.openxmlformats.org/wordprocessingml/2006/main" xmlns:w14="http://schemas.microsoft.com/office/word/2010/wordml" xmlns:w15="http://schemas.microsoft.com/office/word/2012/wordml" xmlns:w16cex="http://schemas.microsoft.com/office/word/2018/wordml/cex" xmlns:w16cid="http://schemas.microsoft.com/office/word/2016/wordml/cid" xmlns:w16="http://schemas.microsoft.com/office/word/2018/wordml" xmlns:w16du="http://schemas.microsoft.com/office/word/2023/wordml/word16du" xmlns:w16sdtdh="http://schemas.microsoft.com/office/word/2020/wordml/sdtdatahash" xmlns:w16sdtfl="http://schemas.microsoft.com/office/word/2024/wordml/sdtformatlock" xmlns:w16se="http://schemas.microsoft.com/office/word/2015/wordml/symex" xmlns:wpg="http://schemas.microsoft.com/office/word/2010/wordprocessingGroup" xmlns:wpi="http://schemas.microsoft.com/office/word/2010/wordprocessingInk" xmlns:wne="http://schemas.microsoft.com/office/word/2006/wordml" xmlns:wps="http://schemas.microsoft.com/office/word/2010/wordprocessingShape" mc:Ignorable="w14 w15 w16se w16cid w16 w16cex w16sdtdh w16sdtfl w16du wp14">
+<w:hdr xmlns:wpc="http://schemas.microsoft.com/office/word/2010/wordprocessingCanvas" xmlns:cx="http://schemas.microsoft.com/office/drawing/2014/chartex" xmlns:cx1="http://schemas.microsoft.com/office/drawing/2015/9/8/chartex" xmlns:cx2="http://schemas.microsoft.com/office/drawing/2015/10/21/chartex" xmlns:cx3="http://schemas.microsoft.com/office/drawing/2016/5/9/chartex" xmlns:cx4="http://schemas.microsoft.com/office/drawing/2016/5/10/chartex" xmlns:cx5="http://schemas.microsoft.com/office/drawing/2016/5/11/chartex" xmlns:cx6="http://schemas.microsoft.com/office/drawing/2016/5/12/chartex" xmlns:cx7="http://schemas.microsoft.com/office/drawing/2016/5/13/chartex" xmlns:cx8="http://schemas.microsoft.com/office/drawing/2016/5/14/chartex" xmlns:mc="http://schemas.openxmlformats.org/markup-compatibility/2006" xmlns:aink="http://schemas.microsoft.com/office/drawing/2016/ink" xmlns:am3d="http://schemas.microsoft.com/office/drawing/2017/model3d" xmlns:o="urn:schemas-microsoft-com:office:office" xmlns:r="http://schemas.openxmlformats.org/officeDocument/2006/relationships" xmlns:m="http://schemas.openxmlformats.org/officeDocument/2006/math" xmlns:v="urn:schemas-microsoft-com:vml" xmlns:wp14="http://schemas.microsoft.com/office/word/2010/wordprocessingDrawing" xmlns:wp="http://schemas.openxmlformats.org/drawingml/2006/wordprocessingDrawing" xmlns:w10="urn:schemas-microsoft-com:office:word" xmlns:w="http://schemas.openxmlformats.org/wordprocessingml/2006/main" xmlns:w14="http://schemas.microsoft.com/office/word/2010/wordml" xmlns:w15="http://schemas.microsoft.com/office/word/2012/wordml" xmlns:w16cex="http://schemas.microsoft.com/office/word/2018/wordml/cex" xmlns:w16cid="http://schemas.microsoft.com/office/word/2016/wordml/cid" xmlns:w16="http://schemas.microsoft.com/office/word/2018/wordml" xmlns:w16sdtdh="http://schemas.microsoft.com/office/word/2020/wordml/sdtdatahash" xmlns:w16se="http://schemas.microsoft.com/office/word/2015/wordml/symex" xmlns:wpg="http://schemas.microsoft.com/office/word/2010/wordprocessingGroup" xmlns:wpi="http://schemas.microsoft.com/office/word/2010/wordprocessingInk" xmlns:wne="http://schemas.microsoft.com/office/word/2006/wordml" xmlns:wps="http://schemas.microsoft.com/office/word/2010/wordprocessingShape" mc:Ignorable="w14 w15 w16se w16cid w16 w16cex w16sdtdh wp14">
   <w:p>
     <w:pPr>
       <w:pStyle w:val="Header"/>
@@ -942,7 +941,7 @@
       <w:rPr>
         <w:noProof/>
       </w:rPr>
-      <w:pict w14:anchorId="4F56EC9F">
+      <w:pict w14:anchorId="15732009">
         <v:shapetype id="_x0000_t75" coordsize="21600,21600" o:spt="75" o:preferrelative="t" path="m@4@5l@4@11@9@11@9@5xe" filled="f" stroked="f">
           <v:stroke joinstyle="miter"/>
           <v:formulas>
@@ -962,7 +961,7 @@
           <v:path o:extrusionok="f" gradientshapeok="t" o:connecttype="rect"/>
           <o:lock v:ext="edit" aspectratio="t"/>
         </v:shapetype>
-        <v:shape id="WordPictureWatermark1401617356" o:spid="_x0000_s1027" type="#_x0000_t75" alt="" style="position:absolute;margin-left:0;margin-top:0;width:466.55pt;height:326.6pt;z-index:-251645952;mso-wrap-edited:f;mso-width-percent:0;mso-height-percent:0;mso-position-horizontal:center;mso-position-horizontal-relative:margin;mso-position-vertical:center;mso-position-vertical-relative:margin;mso-width-percent:0;mso-height-percent:0" o:allowincell="f">
+        <v:shape id="WordPictureWatermark1401617356" o:spid="_x0000_s2051" type="#_x0000_t75" alt="" style="position:absolute;margin-left:0;margin-top:0;width:466.55pt;height:326.6pt;z-index:-251645952;mso-wrap-edited:f;mso-width-percent:0;mso-height-percent:0;mso-position-horizontal:center;mso-position-horizontal-relative:margin;mso-position-vertical:center;mso-position-vertical-relative:margin;mso-width-percent:0;mso-height-percent:0" o:allowincell="f">
           <v:imagedata r:id="rId1" o:title="Airkrit LR" gain="19661f" blacklevel="22938f"/>
           <w10:wrap anchorx="margin" anchory="margin"/>
         </v:shape>
@@ -973,7 +972,7 @@
 </file>
 
 <file path=word/header2.xml><?xml version="1.0" encoding="utf-8"?>
-<w:hdr xmlns:wpc="http://schemas.microsoft.com/office/word/2010/wordprocessingCanvas" xmlns:cx="http://schemas.microsoft.com/office/drawing/2014/chartex" xmlns:cx1="http://schemas.microsoft.com/office/drawing/2015/9/8/chartex" xmlns:cx2="http://schemas.microsoft.com/office/drawing/2015/10/21/chartex" xmlns:cx3="http://schemas.microsoft.com/office/drawing/2016/5/9/chartex" xmlns:cx4="http://schemas.microsoft.com/office/drawing/2016/5/10/chartex" xmlns:cx5="http://schemas.microsoft.com/office/drawing/2016/5/11/chartex" xmlns:cx6="http://schemas.microsoft.com/office/drawing/2016/5/12/chartex" xmlns:cx7="http://schemas.microsoft.com/office/drawing/2016/5/13/chartex" xmlns:cx8="http://schemas.microsoft.com/office/drawing/2016/5/14/chartex" xmlns:mc="http://schemas.openxmlformats.org/markup-compatibility/2006" xmlns:aink="http://schemas.microsoft.com/office/drawing/2016/ink" xmlns:am3d="http://schemas.microsoft.com/office/drawing/2017/model3d" xmlns:o="urn:schemas-microsoft-com:office:office" xmlns:oel="http://schemas.microsoft.com/office/2019/extlst" xmlns:r="http://schemas.openxmlformats.org/officeDocument/2006/relationships" xmlns:m="http://schemas.openxmlformats.org/officeDocument/2006/math" xmlns:v="urn:schemas-microsoft-com:vml" xmlns:wp14="http://schemas.microsoft.com/office/word/2010/wordprocessingDrawing" xmlns:wp="http://schemas.openxmlformats.org/drawingml/2006/wordprocessingDrawing" xmlns:w10="urn:schemas-microsoft-com:office:word" xmlns:w="http://schemas.openxmlformats.org/wordprocessingml/2006/main" xmlns:w14="http://schemas.microsoft.com/office/word/2010/wordml" xmlns:w15="http://schemas.microsoft.com/office/word/2012/wordml" xmlns:w16cex="http://schemas.microsoft.com/office/word/2018/wordml/cex" xmlns:w16cid="http://schemas.microsoft.com/office/word/2016/wordml/cid" xmlns:w16="http://schemas.microsoft.com/office/word/2018/wordml" xmlns:w16du="http://schemas.microsoft.com/office/word/2023/wordml/word16du" xmlns:w16sdtdh="http://schemas.microsoft.com/office/word/2020/wordml/sdtdatahash" xmlns:w16sdtfl="http://schemas.microsoft.com/office/word/2024/wordml/sdtformatlock" xmlns:w16se="http://schemas.microsoft.com/office/word/2015/wordml/symex" xmlns:wpg="http://schemas.microsoft.com/office/word/2010/wordprocessingGroup" xmlns:wpi="http://schemas.microsoft.com/office/word/2010/wordprocessingInk" xmlns:wne="http://schemas.microsoft.com/office/word/2006/wordml" xmlns:wps="http://schemas.microsoft.com/office/word/2010/wordprocessingShape" mc:Ignorable="w14 w15 w16se w16cid w16 w16cex w16sdtdh w16sdtfl w16du wp14">
+<w:hdr xmlns:wpc="http://schemas.microsoft.com/office/word/2010/wordprocessingCanvas" xmlns:cx="http://schemas.microsoft.com/office/drawing/2014/chartex" xmlns:cx1="http://schemas.microsoft.com/office/drawing/2015/9/8/chartex" xmlns:cx2="http://schemas.microsoft.com/office/drawing/2015/10/21/chartex" xmlns:cx3="http://schemas.microsoft.com/office/drawing/2016/5/9/chartex" xmlns:cx4="http://schemas.microsoft.com/office/drawing/2016/5/10/chartex" xmlns:cx5="http://schemas.microsoft.com/office/drawing/2016/5/11/chartex" xmlns:cx6="http://schemas.microsoft.com/office/drawing/2016/5/12/chartex" xmlns:cx7="http://schemas.microsoft.com/office/drawing/2016/5/13/chartex" xmlns:cx8="http://schemas.microsoft.com/office/drawing/2016/5/14/chartex" xmlns:mc="http://schemas.openxmlformats.org/markup-compatibility/2006" xmlns:aink="http://schemas.microsoft.com/office/drawing/2016/ink" xmlns:am3d="http://schemas.microsoft.com/office/drawing/2017/model3d" xmlns:o="urn:schemas-microsoft-com:office:office" xmlns:r="http://schemas.openxmlformats.org/officeDocument/2006/relationships" xmlns:m="http://schemas.openxmlformats.org/officeDocument/2006/math" xmlns:v="urn:schemas-microsoft-com:vml" xmlns:wp14="http://schemas.microsoft.com/office/word/2010/wordprocessingDrawing" xmlns:wp="http://schemas.openxmlformats.org/drawingml/2006/wordprocessingDrawing" xmlns:w10="urn:schemas-microsoft-com:office:word" xmlns:w="http://schemas.openxmlformats.org/wordprocessingml/2006/main" xmlns:w14="http://schemas.microsoft.com/office/word/2010/wordml" xmlns:w15="http://schemas.microsoft.com/office/word/2012/wordml" xmlns:w16cex="http://schemas.microsoft.com/office/word/2018/wordml/cex" xmlns:w16cid="http://schemas.microsoft.com/office/word/2016/wordml/cid" xmlns:w16="http://schemas.microsoft.com/office/word/2018/wordml" xmlns:w16sdtdh="http://schemas.microsoft.com/office/word/2020/wordml/sdtdatahash" xmlns:w16se="http://schemas.microsoft.com/office/word/2015/wordml/symex" xmlns:wpg="http://schemas.microsoft.com/office/word/2010/wordprocessingGroup" xmlns:wpi="http://schemas.microsoft.com/office/word/2010/wordprocessingInk" xmlns:wne="http://schemas.microsoft.com/office/word/2006/wordml" xmlns:wps="http://schemas.microsoft.com/office/word/2010/wordprocessingShape" mc:Ignorable="w14 w15 w16se w16cid w16 w16cex w16sdtdh wp14">
   <w:p>
     <w:pPr>
       <w:pStyle w:val="Header"/>
@@ -982,7 +981,7 @@
       <w:rPr>
         <w:noProof/>
       </w:rPr>
-      <w:pict w14:anchorId="08B957EB">
+      <w:pict w14:anchorId="7CA0B13D">
         <v:shapetype id="_x0000_t75" coordsize="21600,21600" o:spt="75" o:preferrelative="t" path="m@4@5l@4@11@9@11@9@5xe" filled="f" stroked="f">
           <v:stroke joinstyle="miter"/>
           <v:formulas>
@@ -1002,7 +1001,7 @@
           <v:path o:extrusionok="f" gradientshapeok="t" o:connecttype="rect"/>
           <o:lock v:ext="edit" aspectratio="t"/>
         </v:shapetype>
-        <v:shape id="WordPictureWatermark1401617357" o:spid="_x0000_s1026" type="#_x0000_t75" alt="" style="position:absolute;margin-left:0;margin-top:0;width:466.55pt;height:326.6pt;z-index:-251643904;mso-wrap-edited:f;mso-width-percent:0;mso-height-percent:0;mso-position-horizontal:center;mso-position-horizontal-relative:margin;mso-position-vertical:center;mso-position-vertical-relative:margin;mso-width-percent:0;mso-height-percent:0" o:allowincell="f">
+        <v:shape id="WordPictureWatermark1401617357" o:spid="_x0000_s2050" type="#_x0000_t75" alt="" style="position:absolute;margin-left:0;margin-top:0;width:466.55pt;height:326.6pt;z-index:-251643904;mso-wrap-edited:f;mso-width-percent:0;mso-height-percent:0;mso-position-horizontal:center;mso-position-horizontal-relative:margin;mso-position-vertical:center;mso-position-vertical-relative:margin;mso-width-percent:0;mso-height-percent:0" o:allowincell="f">
           <v:imagedata r:id="rId1" o:title="Airkrit LR" gain="19661f" blacklevel="22938f"/>
           <w10:wrap anchorx="margin" anchory="margin"/>
         </v:shape>
@@ -1013,7 +1012,7 @@
 </file>
 
 <file path=word/header3.xml><?xml version="1.0" encoding="utf-8"?>
-<w:hdr xmlns:wpc="http://schemas.microsoft.com/office/word/2010/wordprocessingCanvas" xmlns:cx="http://schemas.microsoft.com/office/drawing/2014/chartex" xmlns:cx1="http://schemas.microsoft.com/office/drawing/2015/9/8/chartex" xmlns:cx2="http://schemas.microsoft.com/office/drawing/2015/10/21/chartex" xmlns:cx3="http://schemas.microsoft.com/office/drawing/2016/5/9/chartex" xmlns:cx4="http://schemas.microsoft.com/office/drawing/2016/5/10/chartex" xmlns:cx5="http://schemas.microsoft.com/office/drawing/2016/5/11/chartex" xmlns:cx6="http://schemas.microsoft.com/office/drawing/2016/5/12/chartex" xmlns:cx7="http://schemas.microsoft.com/office/drawing/2016/5/13/chartex" xmlns:cx8="http://schemas.microsoft.com/office/drawing/2016/5/14/chartex" xmlns:mc="http://schemas.openxmlformats.org/markup-compatibility/2006" xmlns:aink="http://schemas.microsoft.com/office/drawing/2016/ink" xmlns:am3d="http://schemas.microsoft.com/office/drawing/2017/model3d" xmlns:o="urn:schemas-microsoft-com:office:office" xmlns:oel="http://schemas.microsoft.com/office/2019/extlst" xmlns:r="http://schemas.openxmlformats.org/officeDocument/2006/relationships" xmlns:m="http://schemas.openxmlformats.org/officeDocument/2006/math" xmlns:v="urn:schemas-microsoft-com:vml" xmlns:wp14="http://schemas.microsoft.com/office/word/2010/wordprocessingDrawing" xmlns:wp="http://schemas.openxmlformats.org/drawingml/2006/wordprocessingDrawing" xmlns:w10="urn:schemas-microsoft-com:office:word" xmlns:w="http://schemas.openxmlformats.org/wordprocessingml/2006/main" xmlns:w14="http://schemas.microsoft.com/office/word/2010/wordml" xmlns:w15="http://schemas.microsoft.com/office/word/2012/wordml" xmlns:w16cex="http://schemas.microsoft.com/office/word/2018/wordml/cex" xmlns:w16cid="http://schemas.microsoft.com/office/word/2016/wordml/cid" xmlns:w16="http://schemas.microsoft.com/office/word/2018/wordml" xmlns:w16du="http://schemas.microsoft.com/office/word/2023/wordml/word16du" xmlns:w16sdtdh="http://schemas.microsoft.com/office/word/2020/wordml/sdtdatahash" xmlns:w16sdtfl="http://schemas.microsoft.com/office/word/2024/wordml/sdtformatlock" xmlns:w16se="http://schemas.microsoft.com/office/word/2015/wordml/symex" xmlns:wpg="http://schemas.microsoft.com/office/word/2010/wordprocessingGroup" xmlns:wpi="http://schemas.microsoft.com/office/word/2010/wordprocessingInk" xmlns:wne="http://schemas.microsoft.com/office/word/2006/wordml" xmlns:wps="http://schemas.microsoft.com/office/word/2010/wordprocessingShape" mc:Ignorable="w14 w15 w16se w16cid w16 w16cex w16sdtdh w16sdtfl w16du wp14">
+<w:hdr xmlns:wpc="http://schemas.microsoft.com/office/word/2010/wordprocessingCanvas" xmlns:cx="http://schemas.microsoft.com/office/drawing/2014/chartex" xmlns:cx1="http://schemas.microsoft.com/office/drawing/2015/9/8/chartex" xmlns:cx2="http://schemas.microsoft.com/office/drawing/2015/10/21/chartex" xmlns:cx3="http://schemas.microsoft.com/office/drawing/2016/5/9/chartex" xmlns:cx4="http://schemas.microsoft.com/office/drawing/2016/5/10/chartex" xmlns:cx5="http://schemas.microsoft.com/office/drawing/2016/5/11/chartex" xmlns:cx6="http://schemas.microsoft.com/office/drawing/2016/5/12/chartex" xmlns:cx7="http://schemas.microsoft.com/office/drawing/2016/5/13/chartex" xmlns:cx8="http://schemas.microsoft.com/office/drawing/2016/5/14/chartex" xmlns:mc="http://schemas.openxmlformats.org/markup-compatibility/2006" xmlns:aink="http://schemas.microsoft.com/office/drawing/2016/ink" xmlns:am3d="http://schemas.microsoft.com/office/drawing/2017/model3d" xmlns:o="urn:schemas-microsoft-com:office:office" xmlns:r="http://schemas.openxmlformats.org/officeDocument/2006/relationships" xmlns:m="http://schemas.openxmlformats.org/officeDocument/2006/math" xmlns:v="urn:schemas-microsoft-com:vml" xmlns:wp14="http://schemas.microsoft.com/office/word/2010/wordprocessingDrawing" xmlns:wp="http://schemas.openxmlformats.org/drawingml/2006/wordprocessingDrawing" xmlns:w10="urn:schemas-microsoft-com:office:word" xmlns:w="http://schemas.openxmlformats.org/wordprocessingml/2006/main" xmlns:w14="http://schemas.microsoft.com/office/word/2010/wordml" xmlns:w15="http://schemas.microsoft.com/office/word/2012/wordml" xmlns:w16cex="http://schemas.microsoft.com/office/word/2018/wordml/cex" xmlns:w16cid="http://schemas.microsoft.com/office/word/2016/wordml/cid" xmlns:w16="http://schemas.microsoft.com/office/word/2018/wordml" xmlns:w16sdtdh="http://schemas.microsoft.com/office/word/2020/wordml/sdtdatahash" xmlns:w16se="http://schemas.microsoft.com/office/word/2015/wordml/symex" xmlns:wpg="http://schemas.microsoft.com/office/word/2010/wordprocessingGroup" xmlns:wpi="http://schemas.microsoft.com/office/word/2010/wordprocessingInk" xmlns:wne="http://schemas.microsoft.com/office/word/2006/wordml" xmlns:wps="http://schemas.microsoft.com/office/word/2010/wordprocessingShape" mc:Ignorable="w14 w15 w16se w16cid w16 w16cex w16sdtdh wp14">
   <w:p>
     <w:pPr>
       <w:pStyle w:val="Header"/>
@@ -1022,7 +1021,7 @@
       <w:rPr>
         <w:noProof/>
       </w:rPr>
-      <w:pict w14:anchorId="2E057D3E">
+      <w:pict w14:anchorId="3BBC654D">
         <v:shapetype id="_x0000_t75" coordsize="21600,21600" o:spt="75" o:preferrelative="t" path="m@4@5l@4@11@9@11@9@5xe" filled="f" stroked="f">
           <v:stroke joinstyle="miter"/>
           <v:formulas>
@@ -1042,7 +1041,7 @@
           <v:path o:extrusionok="f" gradientshapeok="t" o:connecttype="rect"/>
           <o:lock v:ext="edit" aspectratio="t"/>
         </v:shapetype>
-        <v:shape id="WordPictureWatermark1401617355" o:spid="_x0000_s1025" type="#_x0000_t75" alt="" style="position:absolute;margin-left:0;margin-top:0;width:466.55pt;height:326.6pt;z-index:-251648000;mso-wrap-edited:f;mso-width-percent:0;mso-height-percent:0;mso-position-horizontal:center;mso-position-horizontal-relative:margin;mso-position-vertical:center;mso-position-vertical-relative:margin;mso-width-percent:0;mso-height-percent:0" o:allowincell="f">
+        <v:shape id="WordPictureWatermark1401617355" o:spid="_x0000_s2049" type="#_x0000_t75" alt="" style="position:absolute;margin-left:0;margin-top:0;width:466.55pt;height:326.6pt;z-index:-251648000;mso-wrap-edited:f;mso-width-percent:0;mso-height-percent:0;mso-position-horizontal:center;mso-position-horizontal-relative:margin;mso-position-vertical:center;mso-position-vertical-relative:margin;mso-width-percent:0;mso-height-percent:0" o:allowincell="f">
           <v:imagedata r:id="rId1" o:title="Airkrit LR" gain="19661f" blacklevel="22938f"/>
           <w10:wrap anchorx="margin" anchory="margin"/>
         </v:shape>
@@ -1053,7 +1052,7 @@
 </file>
 
 <file path=word/styles.xml><?xml version="1.0" encoding="utf-8"?>
-<w:styles xmlns:mc="http://schemas.openxmlformats.org/markup-compatibility/2006" xmlns:r="http://schemas.openxmlformats.org/officeDocument/2006/relationships" xmlns:w="http://schemas.openxmlformats.org/wordprocessingml/2006/main" xmlns:w14="http://schemas.microsoft.com/office/word/2010/wordml" xmlns:w15="http://schemas.microsoft.com/office/word/2012/wordml" xmlns:w16cex="http://schemas.microsoft.com/office/word/2018/wordml/cex" xmlns:w16cid="http://schemas.microsoft.com/office/word/2016/wordml/cid" xmlns:w16="http://schemas.microsoft.com/office/word/2018/wordml" xmlns:w16du="http://schemas.microsoft.com/office/word/2023/wordml/word16du" xmlns:w16sdtdh="http://schemas.microsoft.com/office/word/2020/wordml/sdtdatahash" xmlns:w16sdtfl="http://schemas.microsoft.com/office/word/2024/wordml/sdtformatlock" xmlns:w16se="http://schemas.microsoft.com/office/word/2015/wordml/symex" mc:Ignorable="w14 w15 w16se w16cid w16 w16cex w16sdtdh w16sdtfl w16du">
+<w:styles xmlns:mc="http://schemas.openxmlformats.org/markup-compatibility/2006" xmlns:r="http://schemas.openxmlformats.org/officeDocument/2006/relationships" xmlns:w="http://schemas.openxmlformats.org/wordprocessingml/2006/main" xmlns:w14="http://schemas.microsoft.com/office/word/2010/wordml" xmlns:w15="http://schemas.microsoft.com/office/word/2012/wordml" xmlns:w16cex="http://schemas.microsoft.com/office/word/2018/wordml/cex" xmlns:w16cid="http://schemas.microsoft.com/office/word/2016/wordml/cid" xmlns:w16="http://schemas.microsoft.com/office/word/2018/wordml" xmlns:w16sdtdh="http://schemas.microsoft.com/office/word/2020/wordml/sdtdatahash" xmlns:w16se="http://schemas.microsoft.com/office/word/2015/wordml/symex" mc:Ignorable="w14 w15 w16se w16cid w16 w16cex w16sdtdh">
   <w:docDefaults>
     <w:rPrDefault>
       <w:rPr>

</xml_diff>

<commit_message>
feat: introduce coupon management system by adding coupon model, services, and routes, enhancing user experience with coupon validation and application features
</commit_message>
<xml_diff>
--- a/frontend/public/course-certificates/Certificates/Airkrit India Course Certificate - AI-01171 - Template.docx
+++ b/frontend/public/course-certificates/Certificates/Airkrit India Course Certificate - AI-01171 - Template.docx
@@ -342,11 +342,19 @@
           <w:lang w:eastAsia="en-IN"/>
         </w:rPr>
       </w:pPr>
-      <w:r>
-        <w:rPr>
-          <w:b/>
-        </w:rPr>
-        <w:t xml:space="preserve">ID : </w:t>
+      <w:proofErr w:type="gramStart"/>
+      <w:r>
+        <w:rPr>
+          <w:b/>
+        </w:rPr>
+        <w:t>ID :</w:t>
+      </w:r>
+      <w:proofErr w:type="gramEnd"/>
+      <w:r>
+        <w:rPr>
+          <w:b/>
+        </w:rPr>
+        <w:t xml:space="preserve"> </w:t>
       </w:r>
       <w:r>
         <w:rPr>
@@ -656,6 +664,32 @@
           <w:szCs w:val="22"/>
           <w:lang w:eastAsia="en-US"/>
         </w:rPr>
+      </w:pPr>
+    </w:p>
+    <w:p>
+      <w:pPr>
+        <w:rPr>
+          <w:rStyle w:val="Hyperlink"/>
+          <w:u w:val="none"/>
+        </w:rPr>
+        <w:sectPr>
+          <w:headerReference w:type="even" r:id="rId9"/>
+          <w:headerReference w:type="default" r:id="rId10"/>
+          <w:footerReference w:type="even" r:id="rId11"/>
+          <w:footerReference w:type="default" r:id="rId12"/>
+          <w:headerReference w:type="first" r:id="rId13"/>
+          <w:footerReference w:type="first" r:id="rId14"/>
+          <w:pgSz w:w="11906" w:h="16838"/>
+          <w:pgMar w:top="741" w:right="991" w:bottom="444" w:left="1440" w:header="708" w:footer="708" w:gutter="0"/>
+          <w:pgBorders w:offsetFrom="page">
+            <w:top w:val="single" w:sz="4" w:space="24" w:color="auto"/>
+            <w:left w:val="single" w:sz="4" w:space="24" w:color="auto"/>
+            <w:bottom w:val="single" w:sz="4" w:space="24" w:color="auto"/>
+            <w:right w:val="single" w:sz="4" w:space="24" w:color="auto"/>
+          </w:pgBorders>
+          <w:cols w:space="708"/>
+          <w:docGrid w:linePitch="360"/>
+        </w:sectPr>
       </w:pPr>
     </w:p>
     <w:p>
@@ -679,7 +713,7 @@
                     <pic:cNvPicPr/>
                   </pic:nvPicPr>
                   <pic:blipFill>
-                    <a:blip r:embed="rId9"/>
+                    <a:blip r:embed="rId15"/>
                     <a:stretch>
                       <a:fillRect/>
                     </a:stretch>
@@ -703,6 +737,37 @@
     <w:p>
       <w:pPr>
         <w:pStyle w:val="NoSpacing"/>
+        <w:spacing w:before="1560"/>
+        <w:jc w:val="right"/>
+        <w:rPr>
+          <w:b/>
+          <w:bCs/>
+        </w:rPr>
+        <w:sectPr>
+          <w:type w:val="continuous"/>
+          <w:pgSz w:w="11906" w:h="16838"/>
+          <w:pgMar w:top="743" w:right="992" w:bottom="442" w:left="1440" w:header="709" w:footer="709" w:gutter="0"/>
+          <w:pgBorders w:offsetFrom="page">
+            <w:top w:val="single" w:sz="4" w:space="24" w:color="auto"/>
+            <w:left w:val="single" w:sz="4" w:space="24" w:color="auto"/>
+            <w:bottom w:val="single" w:sz="4" w:space="24" w:color="auto"/>
+            <w:right w:val="single" w:sz="4" w:space="24" w:color="auto"/>
+          </w:pgBorders>
+          <w:cols w:num="2" w:space="708"/>
+          <w:docGrid w:linePitch="360"/>
+        </w:sectPr>
+      </w:pPr>
+      <w:r>
+        <w:rPr>
+          <w:rStyle w:val="Hyperlink"/>
+          <w:u w:val="none"/>
+        </w:rPr>
+        <w:t>[%qrImage]</w:t>
+      </w:r>
+    </w:p>
+    <w:p>
+      <w:pPr>
+        <w:pStyle w:val="NoSpacing"/>
         <w:rPr>
           <w:b/>
           <w:bCs/>
@@ -790,6 +855,13 @@
           <w:bCs/>
         </w:rPr>
         <w:t>Education to Employment</w:t>
+      </w:r>
+      <w:r>
+        <w:rPr>
+          <w:b/>
+          <w:bCs/>
+        </w:rPr>
+        <w:t xml:space="preserve"> </w:t>
       </w:r>
     </w:p>
     <w:p>
@@ -814,13 +886,16 @@
       <w:pPr>
         <w:pStyle w:val="NoSpacing"/>
         <w:rPr>
-          <w:color w:val="0000FF" w:themeColor="hyperlink"/>
-        </w:rPr>
-      </w:pPr>
-      <w:r>
-        <w:t xml:space="preserve">Note : Future verification can be done on </w:t>
-      </w:r>
-      <w:hyperlink r:id="rId10" w:history="1">
+          <w:rStyle w:val="Hyperlink"/>
+        </w:rPr>
+      </w:pPr>
+      <w:r>
+        <w:t>Note:</w:t>
+      </w:r>
+      <w:r>
+        <w:t xml:space="preserve"> Future verification can be done on </w:t>
+      </w:r>
+      <w:hyperlink r:id="rId16" w:history="1">
         <w:r>
           <w:rPr>
             <w:rStyle w:val="Hyperlink"/>
@@ -829,15 +904,33 @@
         </w:r>
       </w:hyperlink>
     </w:p>
+    <w:p>
+      <w:pPr>
+        <w:pStyle w:val="NoSpacing"/>
+        <w:jc w:val="right"/>
+        <w:rPr>
+          <w:color w:val="0000FF" w:themeColor="hyperlink"/>
+        </w:rPr>
+      </w:pPr>
+      <w:r>
+        <w:rPr>
+          <w:rStyle w:val="Hyperlink"/>
+          <w:u w:val="none"/>
+        </w:rPr>
+        <w:t xml:space="preserve"> </w:t>
+      </w:r>
+      <w:r>
+        <w:rPr>
+          <w:rStyle w:val="Hyperlink"/>
+          <w:u w:val="none"/>
+        </w:rPr>
+        <w:t xml:space="preserve">                                                       </w:t>
+      </w:r>
+    </w:p>
     <w:sectPr>
-      <w:headerReference w:type="even" r:id="rId11"/>
-      <w:headerReference w:type="default" r:id="rId12"/>
-      <w:footerReference w:type="even" r:id="rId13"/>
-      <w:footerReference w:type="default" r:id="rId14"/>
-      <w:headerReference w:type="first" r:id="rId15"/>
-      <w:footerReference w:type="first" r:id="rId16"/>
+      <w:type w:val="continuous"/>
       <w:pgSz w:w="11906" w:h="16838"/>
-      <w:pgMar w:top="741" w:right="1133" w:bottom="444" w:left="1440" w:header="708" w:footer="708" w:gutter="0"/>
+      <w:pgMar w:top="741" w:right="991" w:bottom="444" w:left="1440" w:header="708" w:footer="708" w:gutter="0"/>
       <w:pgBorders w:offsetFrom="page">
         <w:top w:val="single" w:sz="4" w:space="24" w:color="auto"/>
         <w:left w:val="single" w:sz="4" w:space="24" w:color="auto"/>

</xml_diff>